<commit_message>
Retire 7 products: old URLs point to free pages
</commit_message>
<xml_diff>
--- a/downloads/work-one-on-one-questions-to-ask-your-manager.docx
+++ b/downloads/work-one-on-one-questions-to-ask-your-manager.docx
@@ -610,42 +610,6 @@
           <w:sz w:val="18"/>
         </w:rPr>
         <w:t xml:space="preserve">More free pages: https://proskillpacks.github.io/work/</w:t>
-      </w:r>
-    </w:p>
-    <w:p>
-      <w:pPr>
-        <w:spacing w:after="120"/>
-      </w:pPr>
-      <w:r>
-        <w:rPr>
-          <w:color w:val="666666"/>
-          <w:sz w:val="18"/>
-        </w:rPr>
-        <w:t xml:space="preserve">The full version: Ask for a raise. Your case on one page, the email asking for a meeting, what to say, and what to send after a yes, a not now or a no. Word files you fill in.</w:t>
-      </w:r>
-    </w:p>
-    <w:p>
-      <w:pPr>
-        <w:spacing w:after="120"/>
-      </w:pPr>
-      <w:r>
-        <w:rPr>
-          <w:color w:val="666666"/>
-          <w:sz w:val="18"/>
-        </w:rPr>
-        <w:t xml:space="preserve">$9, one price. Half price for the first 10 buyers with code FIRST10. 30-day refund.</w:t>
-      </w:r>
-    </w:p>
-    <w:p>
-      <w:pPr>
-        <w:spacing w:after="120"/>
-      </w:pPr>
-      <w:r>
-        <w:rPr>
-          <w:color w:val="666666"/>
-          <w:sz w:val="18"/>
-        </w:rPr>
-        <w:t xml:space="preserve">More about it: https://proskillpacks.github.io/work/#ask-for-a-raise</w:t>
       </w:r>
     </w:p>
     <w:sectPr>

</xml_diff>